<commit_message>
Use official logo.png instead of generated placeholder
Replace the Pillow-rendered wordmark with the real Curium logo.png
from the repository root.

https://claude.ai/code/session_015B3yXKTR8ayRzVbvAmrArn
</commit_message>
<xml_diff>
--- a/Isotope_Dashboard_Manual.docx
+++ b/Isotope_Dashboard_Manual.docx
@@ -10,7 +10,7 @@
       <w:r>
         <w:drawing>
           <wp:inline xmlns:a="http://schemas.openxmlformats.org/drawingml/2006/main" xmlns:pic="http://schemas.openxmlformats.org/drawingml/2006/picture">
-            <wp:extent cx="2880000" cy="960000"/>
+            <wp:extent cx="2880000" cy="946849"/>
             <wp:docPr id="1" name="Picture 1"/>
             <wp:cNvGraphicFramePr>
               <a:graphicFrameLocks noChangeAspect="1"/>
@@ -31,7 +31,7 @@
                   <pic:spPr>
                     <a:xfrm>
                       <a:off x="0" y="0"/>
-                      <a:ext cx="2880000" cy="960000"/>
+                      <a:ext cx="2880000" cy="946849"/>
                     </a:xfrm>
                     <a:prstGeom prst="rect"/>
                   </pic:spPr>
@@ -27124,7 +27124,7 @@
           <w:r>
             <w:drawing>
               <wp:inline xmlns:a="http://schemas.openxmlformats.org/drawingml/2006/main" xmlns:pic="http://schemas.openxmlformats.org/drawingml/2006/picture">
-                <wp:extent cx="1800000" cy="600000"/>
+                <wp:extent cx="1800000" cy="591781"/>
                 <wp:docPr id="1" name="Picture 1"/>
                 <wp:cNvGraphicFramePr>
                   <a:graphicFrameLocks noChangeAspect="1"/>
@@ -27145,7 +27145,7 @@
                       <pic:spPr>
                         <a:xfrm>
                           <a:off x="0" y="0"/>
-                          <a:ext cx="1800000" cy="600000"/>
+                          <a:ext cx="1800000" cy="591781"/>
                         </a:xfrm>
                         <a:prstGeom prst="rect"/>
                       </pic:spPr>
@@ -27236,7 +27236,7 @@
     <w:r>
       <w:drawing>
         <wp:inline xmlns:a="http://schemas.openxmlformats.org/drawingml/2006/main" xmlns:pic="http://schemas.openxmlformats.org/drawingml/2006/picture">
-          <wp:extent cx="1080000" cy="360000"/>
+          <wp:extent cx="1080000" cy="355068"/>
           <wp:docPr id="1" name="Picture 1"/>
           <wp:cNvGraphicFramePr>
             <a:graphicFrameLocks noChangeAspect="1"/>
@@ -27257,7 +27257,7 @@
                 <pic:spPr>
                   <a:xfrm>
                     <a:off x="0" y="0"/>
-                    <a:ext cx="1080000" cy="360000"/>
+                    <a:ext cx="1080000" cy="355068"/>
                   </a:xfrm>
                   <a:prstGeom prst="rect"/>
                 </pic:spPr>

</xml_diff>

<commit_message>
Fix logo not rendering in Word document
Two bugs prevented the logo from showing:

1. RGBA PNG - Word cannot reliably render transparent PNGs in headers
   or body. Flatten logo.png to RGB with white background before embedding.

2. Duplicate drawing ids - python-docx starts the wp:docPr id counter at 1
   for each document part independently. All three drawings (first-page
   header, subsequent-page header, title page body) were id="1", causing
   Word to silently drop the duplicates. Add a global _next_drawing_id()
   counter and _fix_drawing_ids() helper to ensure unique ids (1, 2, 3)
   across all parts.

https://claude.ai/code/session_015B3yXKTR8ayRzVbvAmrArn
</commit_message>
<xml_diff>
--- a/Isotope_Dashboard_Manual.docx
+++ b/Isotope_Dashboard_Manual.docx
@@ -11,7 +11,7 @@
         <w:drawing>
           <wp:inline xmlns:a="http://schemas.openxmlformats.org/drawingml/2006/main" xmlns:pic="http://schemas.openxmlformats.org/drawingml/2006/picture">
             <wp:extent cx="2880000" cy="946849"/>
-            <wp:docPr id="1" name="Picture 1"/>
+            <wp:docPr id="3" name="Picture 1"/>
             <wp:cNvGraphicFramePr>
               <a:graphicFrameLocks noChangeAspect="1"/>
             </wp:cNvGraphicFramePr>
@@ -27237,7 +27237,7 @@
       <w:drawing>
         <wp:inline xmlns:a="http://schemas.openxmlformats.org/drawingml/2006/main" xmlns:pic="http://schemas.openxmlformats.org/drawingml/2006/picture">
           <wp:extent cx="1080000" cy="355068"/>
-          <wp:docPr id="1" name="Picture 1"/>
+          <wp:docPr id="2" name="Picture 1"/>
           <wp:cNvGraphicFramePr>
             <a:graphicFrameLocks noChangeAspect="1"/>
           </wp:cNvGraphicFramePr>

</xml_diff>

<commit_message>
Add author attribution for R.A.F. Sierkstra (SIE)
Three locations:

1. Title page — a small borderless author/contact table beneath the meta
   lines showing Name (with abbreviation SIE), Function, and contact details
   (ext. 7062 / reinder.sierkstra@curiumpharma.com) in the document's purple/
   grey brand palette.

2. Footer — author name and abbreviation added to the running footer so the
   attribution appears on every page of the manual.

3. README.txt — new section 14 "Contact / Maintainer" with full name,
   function, extension, and e-mail address.

https://claude.ai/code/session_015B3yXKTR8ayRzVbvAmrArn
</commit_message>
<xml_diff>
--- a/Isotope_Dashboard_Manual.docx
+++ b/Isotope_Dashboard_Manual.docx
@@ -153,6 +153,164 @@
         <w:t>Confidential — internal use only</w:t>
       </w:r>
     </w:p>
+    <w:p/>
+    <w:tbl>
+      <w:tblPr>
+        <w:tblW w:type="auto" w:w="0"/>
+        <w:jc w:val="center"/>
+        <w:tblLook w:firstColumn="1" w:firstRow="1" w:lastColumn="0" w:lastRow="0" w:noHBand="0" w:noVBand="1" w:val="04A0"/>
+        <w:tblBorders>
+          <w:top w:val="none"/>
+          <w:left w:val="none"/>
+          <w:bottom w:val="none"/>
+          <w:right w:val="none"/>
+          <w:insideH w:val="none"/>
+          <w:insideV w:val="none"/>
+        </w:tblBorders>
+      </w:tblPr>
+      <w:tblGrid>
+        <w:gridCol w:w="4536"/>
+        <w:gridCol w:w="4536"/>
+      </w:tblGrid>
+      <w:tr>
+        <w:tc>
+          <w:tcPr>
+            <w:tcW w:type="dxa" w:w="1200"/>
+            <w:tcW/>
+          </w:tcPr>
+          <w:p>
+            <w:pPr>
+              <w:jc w:val="right"/>
+              <w:spacing w:before="20" w:after="20"/>
+            </w:pPr>
+            <w:r>
+              <w:rPr>
+                <w:rFonts w:ascii="Calibri" w:hAnsi="Calibri"/>
+                <w:b/>
+                <w:i w:val="0"/>
+                <w:color w:val="4B1E52"/>
+                <w:sz w:val="18"/>
+                <w:u w:val="none"/>
+              </w:rPr>
+              <w:t>Author</w:t>
+            </w:r>
+          </w:p>
+        </w:tc>
+        <w:tc>
+          <w:tcPr>
+            <w:tcW w:type="dxa" w:w="4536"/>
+          </w:tcPr>
+          <w:p>
+            <w:pPr>
+              <w:spacing w:before="20" w:after="20"/>
+            </w:pPr>
+            <w:r>
+              <w:rPr>
+                <w:rFonts w:ascii="Calibri" w:hAnsi="Calibri"/>
+                <w:b w:val="0"/>
+                <w:i w:val="0"/>
+                <w:color w:val="808080"/>
+                <w:sz w:val="18"/>
+                <w:u w:val="none"/>
+              </w:rPr>
+              <w:t xml:space="preserve">  R.A.F. Sierkstra  (SIE)</w:t>
+            </w:r>
+          </w:p>
+        </w:tc>
+      </w:tr>
+      <w:tr>
+        <w:tc>
+          <w:tcPr>
+            <w:tcW w:type="dxa" w:w="1200"/>
+            <w:tcW/>
+          </w:tcPr>
+          <w:p>
+            <w:pPr>
+              <w:jc w:val="right"/>
+              <w:spacing w:before="20" w:after="20"/>
+            </w:pPr>
+            <w:r>
+              <w:rPr>
+                <w:rFonts w:ascii="Calibri" w:hAnsi="Calibri"/>
+                <w:b/>
+                <w:i w:val="0"/>
+                <w:color w:val="4B1E52"/>
+                <w:sz w:val="18"/>
+                <w:u w:val="none"/>
+              </w:rPr>
+              <w:t>Function</w:t>
+            </w:r>
+          </w:p>
+        </w:tc>
+        <w:tc>
+          <w:tcPr>
+            <w:tcW w:type="dxa" w:w="4536"/>
+          </w:tcPr>
+          <w:p>
+            <w:pPr>
+              <w:spacing w:before="20" w:after="20"/>
+            </w:pPr>
+            <w:r>
+              <w:rPr>
+                <w:rFonts w:ascii="Calibri" w:hAnsi="Calibri"/>
+                <w:b w:val="0"/>
+                <w:i w:val="0"/>
+                <w:color w:val="808080"/>
+                <w:sz w:val="18"/>
+                <w:u w:val="none"/>
+              </w:rPr>
+              <w:t xml:space="preserve">  Process Reliability Engineer</w:t>
+            </w:r>
+          </w:p>
+        </w:tc>
+      </w:tr>
+      <w:tr>
+        <w:tc>
+          <w:tcPr>
+            <w:tcW w:type="dxa" w:w="1200"/>
+            <w:tcW/>
+          </w:tcPr>
+          <w:p>
+            <w:pPr>
+              <w:jc w:val="right"/>
+              <w:spacing w:before="20" w:after="20"/>
+            </w:pPr>
+            <w:r>
+              <w:rPr>
+                <w:rFonts w:ascii="Calibri" w:hAnsi="Calibri"/>
+                <w:b/>
+                <w:i w:val="0"/>
+                <w:color w:val="4B1E52"/>
+                <w:sz w:val="18"/>
+                <w:u w:val="none"/>
+              </w:rPr>
+              <w:t>Contact</w:t>
+            </w:r>
+          </w:p>
+        </w:tc>
+        <w:tc>
+          <w:tcPr>
+            <w:tcW w:type="dxa" w:w="4536"/>
+          </w:tcPr>
+          <w:p>
+            <w:pPr>
+              <w:spacing w:before="20" w:after="20"/>
+            </w:pPr>
+            <w:r>
+              <w:rPr>
+                <w:rFonts w:ascii="Calibri" w:hAnsi="Calibri"/>
+                <w:b w:val="0"/>
+                <w:i w:val="0"/>
+                <w:color w:val="808080"/>
+                <w:sz w:val="18"/>
+                <w:u w:val="none"/>
+              </w:rPr>
+              <w:t xml:space="preserve">  ext. 7062  ·  reinder.sierkstra@curiumpharma.com</w:t>
+            </w:r>
+          </w:p>
+        </w:tc>
+      </w:tr>
+    </w:tbl>
     <w:p>
       <w:r>
         <w:br w:type="page"/>
@@ -27083,7 +27241,7 @@
         <w:sz w:val="16"/>
         <w:u w:val="none"/>
       </w:rPr>
-      <w:t xml:space="preserve">  |  Isotope Dashboard — Technical Manual  |  Confidential</w:t>
+      <w:t xml:space="preserve">  |  Isotope Dashboard — Technical Manual  |  R.A.F. Sierkstra (SIE)  |  Confidential</w:t>
     </w:r>
   </w:p>
 </w:ftr>

</xml_diff>

<commit_message>
Replace broken box-drawing diagrams with proper Word tables (5.1, 12.1)
The MANUAL.txt tables in sections 5.1 (isotope production table columns)
and 12.1 (settings.yaml paths reference) used Unicode box-drawing characters
(┌ │ ├ └ ─). Calibri has no aligned glyphs for these, so Word rendered them
as garbled text with lines in random positions.

Fix: detect runs of box-drawing lines as a new BOXTABLE category in the
classifier, parse them into logical rows (handling multi-line cells and
wrapped key names like paths.storingen_philips_db), and render each block
as a real Word table with:
  - Purple bold first column (key / table name)
  - Light purple tint on first column cells
  - Correct column widths (4.5 cm label + remaining for value)
  - Standard Table Grid border style

https://claude.ai/code/session_015B3yXKTR8ayRzVbvAmrArn
</commit_message>
<xml_diff>
--- a/Isotope_Dashboard_Manual.docx
+++ b/Isotope_Dashboard_Manual.docx
@@ -13121,6 +13121,7 @@
     <w:p>
       <w:pPr>
         <w:spacing w:before="0" w:after="80"/>
+        <w:spacing w:before="120" w:after="120"/>
       </w:pPr>
       <w:r>
         <w:rPr>
@@ -13134,342 +13135,253 @@
         <w:t>Table-specific columns:</w:t>
       </w:r>
     </w:p>
-    <w:p>
-      <w:pPr>
-        <w:spacing w:before="0" w:after="80"/>
-      </w:pPr>
-      <w:r>
-        <w:rPr>
-          <w:rFonts w:ascii="Calibri" w:hAnsi="Calibri"/>
-          <w:b w:val="0"/>
-          <w:i w:val="0"/>
-          <w:color w:val="000000"/>
-          <w:sz w:val="20"/>
-          <w:u w:val="none"/>
-        </w:rPr>
-        <w:t>┌────────────────┬──────────────────────────────────────────────────────────┐</w:t>
-      </w:r>
-    </w:p>
-    <w:p>
-      <w:pPr>
-        <w:spacing w:before="0" w:after="80"/>
-      </w:pPr>
-      <w:r>
-        <w:rPr>
-          <w:rFonts w:ascii="Calibri" w:hAnsi="Calibri"/>
-          <w:b w:val="0"/>
-          <w:i w:val="0"/>
-          <w:color w:val="000000"/>
-          <w:sz w:val="20"/>
-          <w:u w:val="none"/>
-        </w:rPr>
-        <w:t>│ iodine_data    │ date, value1, value2, efficiency, efficiency_raw,        │</w:t>
-      </w:r>
-    </w:p>
-    <w:p>
-      <w:pPr>
-        <w:spacing w:before="0" w:after="80"/>
-      </w:pPr>
-      <w:r>
-        <w:rPr>
-          <w:rFonts w:ascii="Calibri" w:hAnsi="Calibri"/>
-          <w:b w:val="0"/>
-          <w:i w:val="0"/>
-          <w:color w:val="000000"/>
-          <w:sz w:val="20"/>
-          <w:u w:val="none"/>
-        </w:rPr>
-        <w:t>│                │ identifier, bo_targetstroom, targetstroom, yield_percent,│</w:t>
-      </w:r>
-    </w:p>
-    <w:p>
-      <w:pPr>
-        <w:spacing w:before="0" w:after="80"/>
-      </w:pPr>
-      <w:r>
-        <w:rPr>
-          <w:rFonts w:ascii="Calibri" w:hAnsi="Calibri"/>
-          <w:b w:val="0"/>
-          <w:i w:val="0"/>
-          <w:color w:val="000000"/>
-          <w:sz w:val="20"/>
-          <w:u w:val="none"/>
-        </w:rPr>
-        <w:t>│                │ output_percent, cyclotron, totale_dosis, meting_d1,      │</w:t>
-      </w:r>
-    </w:p>
-    <w:p>
-      <w:pPr>
-        <w:spacing w:before="0" w:after="80"/>
-      </w:pPr>
-      <w:r>
-        <w:rPr>
-          <w:rFonts w:ascii="Calibri" w:hAnsi="Calibri"/>
-          <w:b w:val="0"/>
-          <w:i w:val="0"/>
-          <w:color w:val="000000"/>
-          <w:sz w:val="20"/>
-          <w:u w:val="none"/>
-        </w:rPr>
-        <w:t>│                │ meting_waste, verwacht, stop_datum, stop_tijd,           │</w:t>
-      </w:r>
-    </w:p>
-    <w:p>
-      <w:pPr>
-        <w:spacing w:before="0" w:after="80"/>
-      </w:pPr>
-      <w:r>
-        <w:rPr>
-          <w:rFonts w:ascii="Calibri" w:hAnsi="Calibri"/>
-          <w:b w:val="0"/>
-          <w:i w:val="0"/>
-          <w:color w:val="000000"/>
-          <w:sz w:val="20"/>
-          <w:u w:val="none"/>
-        </w:rPr>
-        <w:t>│                │ start_tijd, totale_bestralingstijd, totale_storingstijd, │</w:t>
-      </w:r>
-    </w:p>
-    <w:p>
-      <w:pPr>
-        <w:spacing w:before="0" w:after="80"/>
-      </w:pPr>
-      <w:r>
-        <w:rPr>
-          <w:rFonts w:ascii="Calibri" w:hAnsi="Calibri"/>
-          <w:b w:val="0"/>
-          <w:i w:val="0"/>
-          <w:color w:val="000000"/>
-          <w:sz w:val="20"/>
-          <w:u w:val="none"/>
-        </w:rPr>
-        <w:t>│                │ opmerking, extracted_at                                  │</w:t>
-      </w:r>
-    </w:p>
-    <w:p>
-      <w:pPr>
-        <w:spacing w:before="0" w:after="80"/>
-      </w:pPr>
-      <w:r>
-        <w:rPr>
-          <w:rFonts w:ascii="Calibri" w:hAnsi="Calibri"/>
-          <w:b w:val="0"/>
-          <w:i w:val="0"/>
-          <w:color w:val="000000"/>
-          <w:sz w:val="20"/>
-          <w:u w:val="none"/>
-        </w:rPr>
-        <w:t>├────────────────┼──────────────────────────────────────────────────────────┤</w:t>
-      </w:r>
-    </w:p>
-    <w:p>
-      <w:pPr>
-        <w:spacing w:before="0" w:after="80"/>
-      </w:pPr>
-      <w:r>
-        <w:rPr>
-          <w:rFonts w:ascii="Calibri" w:hAnsi="Calibri"/>
-          <w:b w:val="0"/>
-          <w:i w:val="0"/>
-          <w:color w:val="000000"/>
-          <w:sz w:val="20"/>
-          <w:u w:val="none"/>
-        </w:rPr>
-        <w:t>│ rubidium_data  │ date, value1, value2, efficiency, identifier, cyclotron, │</w:t>
-      </w:r>
-    </w:p>
-    <w:p>
-      <w:pPr>
-        <w:spacing w:before="0" w:after="80"/>
-      </w:pPr>
-      <w:r>
-        <w:rPr>
-          <w:rFonts w:ascii="Calibri" w:hAnsi="Calibri"/>
-          <w:b w:val="0"/>
-          <w:i w:val="0"/>
-          <w:color w:val="000000"/>
-          <w:sz w:val="20"/>
-          <w:u w:val="none"/>
-        </w:rPr>
-        <w:t>│                │ stroom, duur, eob_tijd, opmerking, extracted_at          │</w:t>
-      </w:r>
-    </w:p>
-    <w:p>
-      <w:pPr>
-        <w:spacing w:before="0" w:after="80"/>
-      </w:pPr>
-      <w:r>
-        <w:rPr>
-          <w:rFonts w:ascii="Calibri" w:hAnsi="Calibri"/>
-          <w:b w:val="0"/>
-          <w:i w:val="0"/>
-          <w:color w:val="000000"/>
-          <w:sz w:val="20"/>
-          <w:u w:val="none"/>
-        </w:rPr>
-        <w:t>├────────────────┼──────────────────────────────────────────────────────────┤</w:t>
-      </w:r>
-    </w:p>
-    <w:p>
-      <w:pPr>
-        <w:spacing w:before="0" w:after="80"/>
-      </w:pPr>
-      <w:r>
-        <w:rPr>
-          <w:rFonts w:ascii="Calibri" w:hAnsi="Calibri"/>
-          <w:b w:val="0"/>
-          <w:i w:val="0"/>
-          <w:color w:val="000000"/>
-          <w:sz w:val="20"/>
-          <w:u w:val="none"/>
-        </w:rPr>
-        <w:t>│ gallium_data   │ date, targetstroom, identifier, cyclotron, duur,         │</w:t>
-      </w:r>
-    </w:p>
-    <w:p>
-      <w:pPr>
-        <w:spacing w:before="0" w:after="80"/>
-      </w:pPr>
-      <w:r>
-        <w:rPr>
-          <w:rFonts w:ascii="Calibri" w:hAnsi="Calibri"/>
-          <w:b w:val="0"/>
-          <w:i w:val="0"/>
-          <w:color w:val="000000"/>
-          <w:sz w:val="20"/>
-          <w:u w:val="none"/>
-        </w:rPr>
-        <w:t>│                │ eobhrmin, opmerking, extracted_at                        │</w:t>
-      </w:r>
-    </w:p>
-    <w:p>
-      <w:pPr>
-        <w:spacing w:before="0" w:after="80"/>
-      </w:pPr>
-      <w:r>
-        <w:rPr>
-          <w:rFonts w:ascii="Calibri" w:hAnsi="Calibri"/>
-          <w:b w:val="0"/>
-          <w:i w:val="0"/>
-          <w:color w:val="000000"/>
-          <w:sz w:val="20"/>
-          <w:u w:val="none"/>
-        </w:rPr>
-        <w:t>├────────────────┼──────────────────────────────────────────────────────────┤</w:t>
-      </w:r>
-    </w:p>
-    <w:p>
-      <w:pPr>
-        <w:spacing w:before="0" w:after="80"/>
-      </w:pPr>
-      <w:r>
-        <w:rPr>
-          <w:rFonts w:ascii="Calibri" w:hAnsi="Calibri"/>
-          <w:b w:val="0"/>
-          <w:i w:val="0"/>
-          <w:color w:val="000000"/>
-          <w:sz w:val="20"/>
-          <w:u w:val="none"/>
-        </w:rPr>
-        <w:t>│ indium_data    │ date, targetstroom, identifier, cyclotron,               │</w:t>
-      </w:r>
-    </w:p>
-    <w:p>
-      <w:pPr>
-        <w:spacing w:before="0" w:after="80"/>
-      </w:pPr>
-      <w:r>
-        <w:rPr>
-          <w:rFonts w:ascii="Calibri" w:hAnsi="Calibri"/>
-          <w:b w:val="0"/>
-          <w:i w:val="0"/>
-          <w:color w:val="000000"/>
-          <w:sz w:val="20"/>
-          <w:u w:val="none"/>
-        </w:rPr>
-        <w:t>│                │ bestralingspositie, duur, eobhrmin, opmerking,           │</w:t>
-      </w:r>
-    </w:p>
-    <w:p>
-      <w:pPr>
-        <w:spacing w:before="0" w:after="80"/>
-      </w:pPr>
-      <w:r>
-        <w:rPr>
-          <w:rFonts w:ascii="Calibri" w:hAnsi="Calibri"/>
-          <w:b w:val="0"/>
-          <w:i w:val="0"/>
-          <w:color w:val="000000"/>
-          <w:sz w:val="20"/>
-          <w:u w:val="none"/>
-        </w:rPr>
-        <w:t>│                │ extracted_at                                             │</w:t>
-      </w:r>
-    </w:p>
-    <w:p>
-      <w:pPr>
-        <w:spacing w:before="0" w:after="80"/>
-      </w:pPr>
-      <w:r>
-        <w:rPr>
-          <w:rFonts w:ascii="Calibri" w:hAnsi="Calibri"/>
-          <w:b w:val="0"/>
-          <w:i w:val="0"/>
-          <w:color w:val="000000"/>
-          <w:sz w:val="20"/>
-          <w:u w:val="none"/>
-        </w:rPr>
-        <w:t>├────────────────┼──────────────────────────────────────────────────────────┤</w:t>
-      </w:r>
-    </w:p>
-    <w:p>
-      <w:pPr>
-        <w:spacing w:before="0" w:after="80"/>
-      </w:pPr>
-      <w:r>
-        <w:rPr>
-          <w:rFonts w:ascii="Calibri" w:hAnsi="Calibri"/>
-          <w:b w:val="0"/>
-          <w:i w:val="0"/>
-          <w:color w:val="000000"/>
-          <w:sz w:val="20"/>
-          <w:u w:val="none"/>
-        </w:rPr>
-        <w:t>│ thallium_data  │ date, targetstroom, identifier, cyclotron, kant, duur,   │</w:t>
-      </w:r>
-    </w:p>
-    <w:p>
-      <w:pPr>
-        <w:spacing w:before="0" w:after="80"/>
-      </w:pPr>
-      <w:r>
-        <w:rPr>
-          <w:rFonts w:ascii="Calibri" w:hAnsi="Calibri"/>
-          <w:b w:val="0"/>
-          <w:i w:val="0"/>
-          <w:color w:val="000000"/>
-          <w:sz w:val="20"/>
-          <w:u w:val="none"/>
-        </w:rPr>
-        <w:t>│                │ eob_tijd, opmerking, extracted_at                        │</w:t>
-      </w:r>
-    </w:p>
-    <w:p>
-      <w:pPr>
-        <w:spacing w:before="0" w:after="80"/>
-      </w:pPr>
-      <w:r>
-        <w:rPr>
-          <w:rFonts w:ascii="Calibri" w:hAnsi="Calibri"/>
-          <w:b w:val="0"/>
-          <w:i w:val="0"/>
-          <w:color w:val="000000"/>
-          <w:sz w:val="20"/>
-          <w:u w:val="none"/>
-        </w:rPr>
-        <w:t>└────────────────┴──────────────────────────────────────────────────────────┘</w:t>
-      </w:r>
-    </w:p>
+    <w:tbl>
+      <w:tblPr>
+        <w:tblStyle w:val="TableGrid"/>
+        <w:tblW w:type="auto" w:w="0"/>
+        <w:tblLook w:firstColumn="1" w:firstRow="1" w:lastColumn="0" w:lastRow="0" w:noHBand="0" w:noVBand="1" w:val="04A0"/>
+      </w:tblPr>
+      <w:tblGrid>
+        <w:gridCol w:w="4536"/>
+        <w:gridCol w:w="4536"/>
+      </w:tblGrid>
+      <w:tr>
+        <w:tc>
+          <w:tcPr>
+            <w:tcW w:type="dxa" w:w="4536"/>
+            <w:tcW w:w="2551" w:type="dxa"/>
+            <w:shd w:val="clear" w:color="auto" w:fill="EDE7F0"/>
+          </w:tcPr>
+          <w:p>
+            <w:pPr>
+              <w:spacing w:before="40" w:after="40"/>
+            </w:pPr>
+            <w:r>
+              <w:rPr>
+                <w:rFonts w:ascii="Calibri" w:hAnsi="Calibri"/>
+                <w:b/>
+                <w:i w:val="0"/>
+                <w:color w:val="4B1E52"/>
+                <w:sz w:val="18"/>
+                <w:u w:val="none"/>
+              </w:rPr>
+              <w:t>iodine_data</w:t>
+            </w:r>
+          </w:p>
+        </w:tc>
+        <w:tc>
+          <w:tcPr>
+            <w:tcW w:type="dxa" w:w="4536"/>
+            <w:tcW w:w="6519" w:type="dxa"/>
+          </w:tcPr>
+          <w:p>
+            <w:pPr>
+              <w:spacing w:before="40" w:after="40"/>
+            </w:pPr>
+            <w:r>
+              <w:rPr>
+                <w:rFonts w:ascii="Calibri" w:hAnsi="Calibri"/>
+                <w:b w:val="0"/>
+                <w:i w:val="0"/>
+                <w:color w:val="000000"/>
+                <w:sz w:val="18"/>
+                <w:u w:val="none"/>
+              </w:rPr>
+              <w:t>date, value1, value2, efficiency, efficiency_raw, identifier, bo_targetstroom, targetstroom, yield_percent, output_percent, cyclotron, totale_dosis, meting_d1, meting_waste, verwacht, stop_datum, stop_tijd, start_tijd, totale_bestralingstijd, totale_storingstijd, opmerking, extracted_at</w:t>
+            </w:r>
+          </w:p>
+        </w:tc>
+      </w:tr>
+      <w:tr>
+        <w:tc>
+          <w:tcPr>
+            <w:tcW w:type="dxa" w:w="4536"/>
+            <w:tcW w:w="2551" w:type="dxa"/>
+            <w:shd w:val="clear" w:color="auto" w:fill="EDE7F0"/>
+          </w:tcPr>
+          <w:p>
+            <w:pPr>
+              <w:spacing w:before="40" w:after="40"/>
+            </w:pPr>
+            <w:r>
+              <w:rPr>
+                <w:rFonts w:ascii="Calibri" w:hAnsi="Calibri"/>
+                <w:b/>
+                <w:i w:val="0"/>
+                <w:color w:val="4B1E52"/>
+                <w:sz w:val="18"/>
+                <w:u w:val="none"/>
+              </w:rPr>
+              <w:t>rubidium_data</w:t>
+            </w:r>
+          </w:p>
+        </w:tc>
+        <w:tc>
+          <w:tcPr>
+            <w:tcW w:type="dxa" w:w="4536"/>
+            <w:tcW w:w="6519" w:type="dxa"/>
+          </w:tcPr>
+          <w:p>
+            <w:pPr>
+              <w:spacing w:before="40" w:after="40"/>
+            </w:pPr>
+            <w:r>
+              <w:rPr>
+                <w:rFonts w:ascii="Calibri" w:hAnsi="Calibri"/>
+                <w:b w:val="0"/>
+                <w:i w:val="0"/>
+                <w:color w:val="000000"/>
+                <w:sz w:val="18"/>
+                <w:u w:val="none"/>
+              </w:rPr>
+              <w:t>date, value1, value2, efficiency, identifier, cyclotron, stroom, duur, eob_tijd, opmerking, extracted_at</w:t>
+            </w:r>
+          </w:p>
+        </w:tc>
+      </w:tr>
+      <w:tr>
+        <w:tc>
+          <w:tcPr>
+            <w:tcW w:type="dxa" w:w="4536"/>
+            <w:tcW w:w="2551" w:type="dxa"/>
+            <w:shd w:val="clear" w:color="auto" w:fill="EDE7F0"/>
+          </w:tcPr>
+          <w:p>
+            <w:pPr>
+              <w:spacing w:before="40" w:after="40"/>
+            </w:pPr>
+            <w:r>
+              <w:rPr>
+                <w:rFonts w:ascii="Calibri" w:hAnsi="Calibri"/>
+                <w:b/>
+                <w:i w:val="0"/>
+                <w:color w:val="4B1E52"/>
+                <w:sz w:val="18"/>
+                <w:u w:val="none"/>
+              </w:rPr>
+              <w:t>gallium_data</w:t>
+            </w:r>
+          </w:p>
+        </w:tc>
+        <w:tc>
+          <w:tcPr>
+            <w:tcW w:type="dxa" w:w="4536"/>
+            <w:tcW w:w="6519" w:type="dxa"/>
+          </w:tcPr>
+          <w:p>
+            <w:pPr>
+              <w:spacing w:before="40" w:after="40"/>
+            </w:pPr>
+            <w:r>
+              <w:rPr>
+                <w:rFonts w:ascii="Calibri" w:hAnsi="Calibri"/>
+                <w:b w:val="0"/>
+                <w:i w:val="0"/>
+                <w:color w:val="000000"/>
+                <w:sz w:val="18"/>
+                <w:u w:val="none"/>
+              </w:rPr>
+              <w:t>date, targetstroom, identifier, cyclotron, duur, eobhrmin, opmerking, extracted_at</w:t>
+            </w:r>
+          </w:p>
+        </w:tc>
+      </w:tr>
+      <w:tr>
+        <w:tc>
+          <w:tcPr>
+            <w:tcW w:type="dxa" w:w="4536"/>
+            <w:tcW w:w="2551" w:type="dxa"/>
+            <w:shd w:val="clear" w:color="auto" w:fill="EDE7F0"/>
+          </w:tcPr>
+          <w:p>
+            <w:pPr>
+              <w:spacing w:before="40" w:after="40"/>
+            </w:pPr>
+            <w:r>
+              <w:rPr>
+                <w:rFonts w:ascii="Calibri" w:hAnsi="Calibri"/>
+                <w:b/>
+                <w:i w:val="0"/>
+                <w:color w:val="4B1E52"/>
+                <w:sz w:val="18"/>
+                <w:u w:val="none"/>
+              </w:rPr>
+              <w:t>indium_data</w:t>
+            </w:r>
+          </w:p>
+        </w:tc>
+        <w:tc>
+          <w:tcPr>
+            <w:tcW w:type="dxa" w:w="4536"/>
+            <w:tcW w:w="6519" w:type="dxa"/>
+          </w:tcPr>
+          <w:p>
+            <w:pPr>
+              <w:spacing w:before="40" w:after="40"/>
+            </w:pPr>
+            <w:r>
+              <w:rPr>
+                <w:rFonts w:ascii="Calibri" w:hAnsi="Calibri"/>
+                <w:b w:val="0"/>
+                <w:i w:val="0"/>
+                <w:color w:val="000000"/>
+                <w:sz w:val="18"/>
+                <w:u w:val="none"/>
+              </w:rPr>
+              <w:t>date, targetstroom, identifier, cyclotron, bestralingspositie, duur, eobhrmin, opmerking, extracted_at</w:t>
+            </w:r>
+          </w:p>
+        </w:tc>
+      </w:tr>
+      <w:tr>
+        <w:tc>
+          <w:tcPr>
+            <w:tcW w:type="dxa" w:w="4536"/>
+            <w:tcW w:w="2551" w:type="dxa"/>
+            <w:shd w:val="clear" w:color="auto" w:fill="EDE7F0"/>
+          </w:tcPr>
+          <w:p>
+            <w:pPr>
+              <w:spacing w:before="40" w:after="40"/>
+            </w:pPr>
+            <w:r>
+              <w:rPr>
+                <w:rFonts w:ascii="Calibri" w:hAnsi="Calibri"/>
+                <w:b/>
+                <w:i w:val="0"/>
+                <w:color w:val="4B1E52"/>
+                <w:sz w:val="18"/>
+                <w:u w:val="none"/>
+              </w:rPr>
+              <w:t>thallium_data</w:t>
+            </w:r>
+          </w:p>
+        </w:tc>
+        <w:tc>
+          <w:tcPr>
+            <w:tcW w:type="dxa" w:w="4536"/>
+            <w:tcW w:w="6519" w:type="dxa"/>
+          </w:tcPr>
+          <w:p>
+            <w:pPr>
+              <w:spacing w:before="40" w:after="40"/>
+            </w:pPr>
+            <w:r>
+              <w:rPr>
+                <w:rFonts w:ascii="Calibri" w:hAnsi="Calibri"/>
+                <w:b w:val="0"/>
+                <w:i w:val="0"/>
+                <w:color w:val="000000"/>
+                <w:sz w:val="18"/>
+                <w:u w:val="none"/>
+              </w:rPr>
+              <w:t>date, targetstroom, identifier, cyclotron, kant, duur, eob_tijd, opmerking, extracted_at</w:t>
+            </w:r>
+          </w:p>
+        </w:tc>
+      </w:tr>
+    </w:tbl>
+    <w:p/>
     <w:p>
       <w:pPr>
         <w:spacing w:before="0" w:after="80"/>
@@ -24018,6 +23930,7 @@
     <w:p>
       <w:pPr>
         <w:spacing w:before="0" w:after="80"/>
+        <w:spacing w:before="120" w:after="120"/>
       </w:pPr>
       <w:r>
         <w:rPr>
@@ -24031,742 +23944,676 @@
         <w:t>paths section:</w:t>
       </w:r>
     </w:p>
-    <w:p>
-      <w:pPr>
-        <w:spacing w:before="0" w:after="80"/>
-      </w:pPr>
-      <w:r>
-        <w:rPr>
-          <w:rFonts w:ascii="Calibri" w:hAnsi="Calibri"/>
-          <w:b w:val="0"/>
-          <w:i w:val="0"/>
-          <w:color w:val="000000"/>
-          <w:sz w:val="20"/>
-          <w:u w:val="none"/>
-        </w:rPr>
-        <w:t>┌────────────────────────┬──────────────────────────────────────────────────┐</w:t>
-      </w:r>
-    </w:p>
-    <w:p>
-      <w:pPr>
-        <w:spacing w:before="0" w:after="80"/>
-      </w:pPr>
-      <w:r>
-        <w:rPr>
-          <w:rFonts w:ascii="Calibri" w:hAnsi="Calibri"/>
-          <w:b w:val="0"/>
-          <w:i w:val="0"/>
-          <w:color w:val="000000"/>
-          <w:sz w:val="20"/>
-          <w:u w:val="none"/>
-        </w:rPr>
-        <w:t>│ paths.raw_db           │ data/raw.db                                      │</w:t>
-      </w:r>
-    </w:p>
-    <w:p>
-      <w:pPr>
-        <w:spacing w:before="0" w:after="80"/>
-      </w:pPr>
-      <w:r>
-        <w:rPr>
-          <w:rFonts w:ascii="Calibri" w:hAnsi="Calibri"/>
-          <w:b w:val="0"/>
-          <w:i w:val="0"/>
-          <w:color w:val="000000"/>
-          <w:sz w:val="20"/>
-          <w:u w:val="none"/>
-        </w:rPr>
-        <w:t>│                        │ SQLite database for raw production records.      │</w:t>
-      </w:r>
-    </w:p>
-    <w:p>
-      <w:pPr>
-        <w:spacing w:before="0" w:after="80"/>
-      </w:pPr>
-      <w:r>
-        <w:rPr>
-          <w:rFonts w:ascii="Calibri" w:hAnsi="Calibri"/>
-          <w:b w:val="0"/>
-          <w:i w:val="0"/>
-          <w:color w:val="000000"/>
-          <w:sz w:val="20"/>
-          <w:u w:val="none"/>
-        </w:rPr>
-        <w:t>├────────────────────────┼──────────────────────────────────────────────────┤</w:t>
-      </w:r>
-    </w:p>
-    <w:p>
-      <w:pPr>
-        <w:spacing w:before="0" w:after="80"/>
-      </w:pPr>
-      <w:r>
-        <w:rPr>
-          <w:rFonts w:ascii="Calibri" w:hAnsi="Calibri"/>
-          <w:b w:val="0"/>
-          <w:i w:val="0"/>
-          <w:color w:val="000000"/>
-          <w:sz w:val="20"/>
-          <w:u w:val="none"/>
-        </w:rPr>
-        <w:t>│ paths.derived_db       │ data/derived.db                                  │</w:t>
-      </w:r>
-    </w:p>
-    <w:p>
-      <w:pPr>
-        <w:spacing w:before="0" w:after="80"/>
-      </w:pPr>
-      <w:r>
-        <w:rPr>
-          <w:rFonts w:ascii="Calibri" w:hAnsi="Calibri"/>
-          <w:b w:val="0"/>
-          <w:i w:val="0"/>
-          <w:color w:val="000000"/>
-          <w:sz w:val="20"/>
-          <w:u w:val="none"/>
-        </w:rPr>
-        <w:t>│                        │ SQLite database for computed KPIs.               │</w:t>
-      </w:r>
-    </w:p>
-    <w:p>
-      <w:pPr>
-        <w:spacing w:before="0" w:after="80"/>
-      </w:pPr>
-      <w:r>
-        <w:rPr>
-          <w:rFonts w:ascii="Calibri" w:hAnsi="Calibri"/>
-          <w:b w:val="0"/>
-          <w:i w:val="0"/>
-          <w:color w:val="000000"/>
-          <w:sz w:val="20"/>
-          <w:u w:val="none"/>
-        </w:rPr>
-        <w:t>├────────────────────────┼──────────────────────────────────────────────────┤</w:t>
-      </w:r>
-    </w:p>
-    <w:p>
-      <w:pPr>
-        <w:spacing w:before="0" w:after="80"/>
-      </w:pPr>
-      <w:r>
-        <w:rPr>
-          <w:rFonts w:ascii="Calibri" w:hAnsi="Calibri"/>
-          <w:b w:val="0"/>
-          <w:i w:val="0"/>
-          <w:color w:val="000000"/>
-          <w:sz w:val="20"/>
-          <w:u w:val="none"/>
-        </w:rPr>
-        <w:t>│ paths.bestralingen_db  │ \\TUPETT-FI01\Data$\Malshare\Proc\Metrics\       │</w:t>
-      </w:r>
-    </w:p>
-    <w:p>
-      <w:pPr>
-        <w:spacing w:before="0" w:after="80"/>
-      </w:pPr>
-      <w:r>
-        <w:rPr>
-          <w:rFonts w:ascii="Calibri" w:hAnsi="Calibri"/>
-          <w:b w:val="0"/>
-          <w:i w:val="0"/>
-          <w:color w:val="000000"/>
-          <w:sz w:val="20"/>
-          <w:u w:val="none"/>
-        </w:rPr>
-        <w:t>│                        │   thalliumproces\bestralingen.mdb                │</w:t>
-      </w:r>
-    </w:p>
-    <w:p>
-      <w:pPr>
-        <w:spacing w:before="0" w:after="80"/>
-      </w:pPr>
-      <w:r>
-        <w:rPr>
-          <w:rFonts w:ascii="Calibri" w:hAnsi="Calibri"/>
-          <w:b w:val="0"/>
-          <w:i w:val="0"/>
-          <w:color w:val="000000"/>
-          <w:sz w:val="20"/>
-          <w:u w:val="none"/>
-        </w:rPr>
-        <w:t>│                        │ MS Access — primary isotope production records.  │</w:t>
-      </w:r>
-    </w:p>
-    <w:p>
-      <w:pPr>
-        <w:spacing w:before="0" w:after="80"/>
-      </w:pPr>
-      <w:r>
-        <w:rPr>
-          <w:rFonts w:ascii="Calibri" w:hAnsi="Calibri"/>
-          <w:b w:val="0"/>
-          <w:i w:val="0"/>
-          <w:color w:val="000000"/>
-          <w:sz w:val="20"/>
-          <w:u w:val="none"/>
-        </w:rPr>
-        <w:t>│                        │ REQUIRED: pipeline aborts if unreachable.        │</w:t>
-      </w:r>
-    </w:p>
-    <w:p>
-      <w:pPr>
-        <w:spacing w:before="0" w:after="80"/>
-      </w:pPr>
-      <w:r>
-        <w:rPr>
-          <w:rFonts w:ascii="Calibri" w:hAnsi="Calibri"/>
-          <w:b w:val="0"/>
-          <w:i w:val="0"/>
-          <w:color w:val="000000"/>
-          <w:sz w:val="20"/>
-          <w:u w:val="none"/>
-        </w:rPr>
-        <w:t>├────────────────────────┼──────────────────────────────────────────────────┤</w:t>
-      </w:r>
-    </w:p>
-    <w:p>
-      <w:pPr>
-        <w:spacing w:before="0" w:after="80"/>
-      </w:pPr>
-      <w:r>
-        <w:rPr>
-          <w:rFonts w:ascii="Calibri" w:hAnsi="Calibri"/>
-          <w:b w:val="0"/>
-          <w:i w:val="0"/>
-          <w:color w:val="000000"/>
-          <w:sz w:val="20"/>
-          <w:u w:val="none"/>
-        </w:rPr>
-        <w:t>│ paths.proces_db        │ W:\Maximo\ProcesGegevens.accdb                   │</w:t>
-      </w:r>
-    </w:p>
-    <w:p>
-      <w:pPr>
-        <w:spacing w:before="0" w:after="80"/>
-      </w:pPr>
-      <w:r>
-        <w:rPr>
-          <w:rFonts w:ascii="Calibri" w:hAnsi="Calibri"/>
-          <w:b w:val="0"/>
-          <w:i w:val="0"/>
-          <w:color w:val="000000"/>
-          <w:sz w:val="20"/>
-          <w:u w:val="none"/>
-        </w:rPr>
-        <w:t>│                        │ MS Access — efficiency targets and yield data.   │</w:t>
-      </w:r>
-    </w:p>
-    <w:p>
-      <w:pPr>
-        <w:spacing w:before="0" w:after="80"/>
-      </w:pPr>
-      <w:r>
-        <w:rPr>
-          <w:rFonts w:ascii="Calibri" w:hAnsi="Calibri"/>
-          <w:b w:val="0"/>
-          <w:i w:val="0"/>
-          <w:color w:val="000000"/>
-          <w:sz w:val="20"/>
-          <w:u w:val="none"/>
-        </w:rPr>
-        <w:t>├────────────────────────┼──────────────────────────────────────────────────┤</w:t>
-      </w:r>
-    </w:p>
-    <w:p>
-      <w:pPr>
-        <w:spacing w:before="0" w:after="80"/>
-      </w:pPr>
-      <w:r>
-        <w:rPr>
-          <w:rFonts w:ascii="Calibri" w:hAnsi="Calibri"/>
-          <w:b w:val="0"/>
-          <w:i w:val="0"/>
-          <w:color w:val="000000"/>
-          <w:sz w:val="20"/>
-          <w:u w:val="none"/>
-        </w:rPr>
-        <w:t>│ paths.storingen_iba_db │ \\NLPT-FILE01P\Dept$\NLCYC\Storingen IBA\        │</w:t>
-      </w:r>
-    </w:p>
-    <w:p>
-      <w:pPr>
-        <w:spacing w:before="0" w:after="80"/>
-      </w:pPr>
-      <w:r>
-        <w:rPr>
-          <w:rFonts w:ascii="Calibri" w:hAnsi="Calibri"/>
-          <w:b w:val="0"/>
-          <w:i w:val="0"/>
-          <w:color w:val="000000"/>
-          <w:sz w:val="20"/>
-          <w:u w:val="none"/>
-        </w:rPr>
-        <w:t>│                        │   Storingen_IBA.accdb                            │</w:t>
-      </w:r>
-    </w:p>
-    <w:p>
-      <w:pPr>
-        <w:spacing w:before="0" w:after="80"/>
-      </w:pPr>
-      <w:r>
-        <w:rPr>
-          <w:rFonts w:ascii="Calibri" w:hAnsi="Calibri"/>
-          <w:b w:val="0"/>
-          <w:i w:val="0"/>
-          <w:color w:val="000000"/>
-          <w:sz w:val="20"/>
-          <w:u w:val="none"/>
-        </w:rPr>
-        <w:t>│                        │ MS Access — IBA cyclotron downtime records.      │</w:t>
-      </w:r>
-    </w:p>
-    <w:p>
-      <w:pPr>
-        <w:spacing w:before="0" w:after="80"/>
-      </w:pPr>
-      <w:r>
-        <w:rPr>
-          <w:rFonts w:ascii="Calibri" w:hAnsi="Calibri"/>
-          <w:b w:val="0"/>
-          <w:i w:val="0"/>
-          <w:color w:val="000000"/>
-          <w:sz w:val="20"/>
-          <w:u w:val="none"/>
-        </w:rPr>
-        <w:t>├────────────────────────┼──────────────────────────────────────────────────┤</w:t>
-      </w:r>
-    </w:p>
-    <w:p>
-      <w:pPr>
-        <w:spacing w:before="0" w:after="80"/>
-      </w:pPr>
-      <w:r>
-        <w:rPr>
-          <w:rFonts w:ascii="Calibri" w:hAnsi="Calibri"/>
-          <w:b w:val="0"/>
-          <w:i w:val="0"/>
-          <w:color w:val="000000"/>
-          <w:sz w:val="20"/>
-          <w:u w:val="none"/>
-        </w:rPr>
-        <w:t>│ paths.storingen_       │ \\NLPT-FILE01P\Dept$\NLCYC\Storingen Philips\    │</w:t>
-      </w:r>
-    </w:p>
-    <w:p>
-      <w:pPr>
-        <w:spacing w:before="0" w:after="80"/>
-      </w:pPr>
-      <w:r>
-        <w:rPr>
-          <w:rFonts w:ascii="Calibri" w:hAnsi="Calibri"/>
-          <w:b w:val="0"/>
-          <w:i w:val="0"/>
-          <w:color w:val="000000"/>
-          <w:sz w:val="20"/>
-          <w:u w:val="none"/>
-        </w:rPr>
-        <w:t>│   philips_db           │   Storingen_Philips.accdb                        │</w:t>
-      </w:r>
-    </w:p>
-    <w:p>
-      <w:pPr>
-        <w:spacing w:before="0" w:after="80"/>
-      </w:pPr>
-      <w:r>
-        <w:rPr>
-          <w:rFonts w:ascii="Calibri" w:hAnsi="Calibri"/>
-          <w:b w:val="0"/>
-          <w:i w:val="0"/>
-          <w:color w:val="000000"/>
-          <w:sz w:val="20"/>
-          <w:u w:val="none"/>
-        </w:rPr>
-        <w:t>├────────────────────────┼──────────────────────────────────────────────────┤</w:t>
-      </w:r>
-    </w:p>
-    <w:p>
-      <w:pPr>
-        <w:spacing w:before="0" w:after="80"/>
-      </w:pPr>
-      <w:r>
-        <w:rPr>
-          <w:rFonts w:ascii="Calibri" w:hAnsi="Calibri"/>
-          <w:b w:val="0"/>
-          <w:i w:val="0"/>
-          <w:color w:val="000000"/>
-          <w:sz w:val="20"/>
-          <w:u w:val="none"/>
-        </w:rPr>
-        <w:t>│ paths.ploegen_excel    │ C:\Users\Reinder.sierkstra\Desktop\              │</w:t>
-      </w:r>
-    </w:p>
-    <w:p>
-      <w:pPr>
-        <w:spacing w:before="0" w:after="80"/>
-      </w:pPr>
-      <w:r>
-        <w:rPr>
-          <w:rFonts w:ascii="Calibri" w:hAnsi="Calibri"/>
-          <w:b w:val="0"/>
-          <w:i w:val="0"/>
-          <w:color w:val="000000"/>
-          <w:sz w:val="20"/>
-          <w:u w:val="none"/>
-        </w:rPr>
-        <w:t>│                        │   Dosis_overzichten\Ploegen.xlsx                 │</w:t>
-      </w:r>
-    </w:p>
-    <w:p>
-      <w:pPr>
-        <w:spacing w:before="0" w:after="80"/>
-      </w:pPr>
-      <w:r>
-        <w:rPr>
-          <w:rFonts w:ascii="Calibri" w:hAnsi="Calibri"/>
-          <w:b w:val="0"/>
-          <w:i w:val="0"/>
-          <w:color w:val="000000"/>
-          <w:sz w:val="20"/>
-          <w:u w:val="none"/>
-        </w:rPr>
-        <w:t>├────────────────────────┼──────────────────────────────────────────────────┤</w:t>
-      </w:r>
-    </w:p>
-    <w:p>
-      <w:pPr>
-        <w:spacing w:before="0" w:after="80"/>
-      </w:pPr>
-      <w:r>
-        <w:rPr>
-          <w:rFonts w:ascii="Calibri" w:hAnsi="Calibri"/>
-          <w:b w:val="0"/>
-          <w:i w:val="0"/>
-          <w:color w:val="000000"/>
-          <w:sz w:val="20"/>
-          <w:u w:val="none"/>
-        </w:rPr>
-        <w:t>│ paths.planning_excel   │ W:\Afdelingsplanning Cyclotron\                  │</w:t>
-      </w:r>
-    </w:p>
-    <w:p>
-      <w:pPr>
-        <w:spacing w:before="0" w:after="80"/>
-      </w:pPr>
-      <w:r>
-        <w:rPr>
-          <w:rFonts w:ascii="Calibri" w:hAnsi="Calibri"/>
-          <w:b w:val="0"/>
-          <w:i w:val="0"/>
-          <w:color w:val="000000"/>
-          <w:sz w:val="20"/>
-          <w:u w:val="none"/>
-        </w:rPr>
-        <w:t>│                        │   Planning &amp; Control Cyclotron.xlsm             │</w:t>
-      </w:r>
-    </w:p>
-    <w:p>
-      <w:pPr>
-        <w:spacing w:before="0" w:after="80"/>
-      </w:pPr>
-      <w:r>
-        <w:rPr>
-          <w:rFonts w:ascii="Calibri" w:hAnsi="Calibri"/>
-          <w:b w:val="0"/>
-          <w:i w:val="0"/>
-          <w:color w:val="000000"/>
-          <w:sz w:val="20"/>
-          <w:u w:val="none"/>
-        </w:rPr>
-        <w:t>├────────────────────────┼──────────────────────────────────────────────────┤</w:t>
-      </w:r>
-    </w:p>
-    <w:p>
-      <w:pPr>
-        <w:spacing w:before="0" w:after="80"/>
-      </w:pPr>
-      <w:r>
-        <w:rPr>
-          <w:rFonts w:ascii="Calibri" w:hAnsi="Calibri"/>
-          <w:b w:val="0"/>
-          <w:i w:val="0"/>
-          <w:color w:val="000000"/>
-          <w:sz w:val="20"/>
-          <w:u w:val="none"/>
-        </w:rPr>
-        <w:t>│ paths.vsm_excel        │ C:\Users\Reinder.sierkstra\OneDrive - CURIUM\   │</w:t>
-      </w:r>
-    </w:p>
-    <w:p>
-      <w:pPr>
-        <w:spacing w:before="0" w:after="80"/>
-      </w:pPr>
-      <w:r>
-        <w:rPr>
-          <w:rFonts w:ascii="Calibri" w:hAnsi="Calibri"/>
-          <w:b w:val="0"/>
-          <w:i w:val="0"/>
-          <w:color w:val="000000"/>
-          <w:sz w:val="20"/>
-          <w:u w:val="none"/>
-        </w:rPr>
-        <w:t>│                        │   Niet onedrive spullen\Desktop\                 │</w:t>
-      </w:r>
-    </w:p>
-    <w:p>
-      <w:pPr>
-        <w:spacing w:before="0" w:after="80"/>
-      </w:pPr>
-      <w:r>
-        <w:rPr>
-          <w:rFonts w:ascii="Calibri" w:hAnsi="Calibri"/>
-          <w:b w:val="0"/>
-          <w:i w:val="0"/>
-          <w:color w:val="000000"/>
-          <w:sz w:val="20"/>
-          <w:u w:val="none"/>
-        </w:rPr>
-        <w:t>│                        │   Targetstroom daily management VSM cyclotron   │</w:t>
-      </w:r>
-    </w:p>
-    <w:p>
-      <w:pPr>
-        <w:spacing w:before="0" w:after="80"/>
-      </w:pPr>
-      <w:r>
-        <w:rPr>
-          <w:rFonts w:ascii="Calibri" w:hAnsi="Calibri"/>
-          <w:b w:val="0"/>
-          <w:i w:val="0"/>
-          <w:color w:val="000000"/>
-          <w:sz w:val="20"/>
-          <w:u w:val="none"/>
-        </w:rPr>
-        <w:t>│                        │   .xlsx                                          │</w:t>
-      </w:r>
-    </w:p>
-    <w:p>
-      <w:pPr>
-        <w:spacing w:before="0" w:after="80"/>
-      </w:pPr>
-      <w:r>
-        <w:rPr>
-          <w:rFonts w:ascii="Calibri" w:hAnsi="Calibri"/>
-          <w:b w:val="0"/>
-          <w:i w:val="0"/>
-          <w:color w:val="000000"/>
-          <w:sz w:val="20"/>
-          <w:u w:val="none"/>
-        </w:rPr>
-        <w:t>├────────────────────────┼──────────────────────────────────────────────────┤</w:t>
-      </w:r>
-    </w:p>
-    <w:p>
-      <w:pPr>
-        <w:spacing w:before="0" w:after="80"/>
-      </w:pPr>
-      <w:r>
-        <w:rPr>
-          <w:rFonts w:ascii="Calibri" w:hAnsi="Calibri"/>
-          <w:b w:val="0"/>
-          <w:i w:val="0"/>
-          <w:color w:val="000000"/>
-          <w:sz w:val="20"/>
-          <w:u w:val="none"/>
-        </w:rPr>
-        <w:t>│ paths.planning_html    │ W:\Afdelingsplanning Cyclotron\planning.html     │</w:t>
-      </w:r>
-    </w:p>
-    <w:p>
-      <w:pPr>
-        <w:spacing w:before="0" w:after="80"/>
-      </w:pPr>
-      <w:r>
-        <w:rPr>
-          <w:rFonts w:ascii="Calibri" w:hAnsi="Calibri"/>
-          <w:b w:val="0"/>
-          <w:i w:val="0"/>
-          <w:color w:val="000000"/>
-          <w:sz w:val="20"/>
-          <w:u w:val="none"/>
-        </w:rPr>
-        <w:t>├────────────────────────┼──────────────────────────────────────────────────┤</w:t>
-      </w:r>
-    </w:p>
-    <w:p>
-      <w:pPr>
-        <w:spacing w:before="0" w:after="80"/>
-      </w:pPr>
-      <w:r>
-        <w:rPr>
-          <w:rFonts w:ascii="Calibri" w:hAnsi="Calibri"/>
-          <w:b w:val="0"/>
-          <w:i w:val="0"/>
-          <w:color w:val="000000"/>
-          <w:sz w:val="20"/>
-          <w:u w:val="none"/>
-        </w:rPr>
-        <w:t>│ paths.productieschema_ │ W:\Desktop Settings\Cyclotron formulieren\       │</w:t>
-      </w:r>
-    </w:p>
-    <w:p>
-      <w:pPr>
-        <w:spacing w:before="0" w:after="80"/>
-      </w:pPr>
-      <w:r>
-        <w:rPr>
-          <w:rFonts w:ascii="Calibri" w:hAnsi="Calibri"/>
-          <w:b w:val="0"/>
-          <w:i w:val="0"/>
-          <w:color w:val="000000"/>
-          <w:sz w:val="20"/>
-          <w:u w:val="none"/>
-        </w:rPr>
-        <w:t>│   html                 │   0 (BETA) Cyclotron productieplanning.html      │</w:t>
-      </w:r>
-    </w:p>
-    <w:p>
-      <w:pPr>
-        <w:spacing w:before="0" w:after="80"/>
-      </w:pPr>
-      <w:r>
-        <w:rPr>
-          <w:rFonts w:ascii="Calibri" w:hAnsi="Calibri"/>
-          <w:b w:val="0"/>
-          <w:i w:val="0"/>
-          <w:color w:val="000000"/>
-          <w:sz w:val="20"/>
-          <w:u w:val="none"/>
-        </w:rPr>
-        <w:t>├────────────────────────┼──────────────────────────────────────────────────┤</w:t>
-      </w:r>
-    </w:p>
-    <w:p>
-      <w:pPr>
-        <w:spacing w:before="0" w:after="80"/>
-      </w:pPr>
-      <w:r>
-        <w:rPr>
-          <w:rFonts w:ascii="Calibri" w:hAnsi="Calibri"/>
-          <w:b w:val="0"/>
-          <w:i w:val="0"/>
-          <w:color w:val="000000"/>
-          <w:sz w:val="20"/>
-          <w:u w:val="none"/>
-        </w:rPr>
-        <w:t>│ paths.output_local     │ output/isotope_dashboard.html                    │</w:t>
-      </w:r>
-    </w:p>
-    <w:p>
-      <w:pPr>
-        <w:spacing w:before="0" w:after="80"/>
-      </w:pPr>
-      <w:r>
-        <w:rPr>
-          <w:rFonts w:ascii="Calibri" w:hAnsi="Calibri"/>
-          <w:b w:val="0"/>
-          <w:i w:val="0"/>
-          <w:color w:val="000000"/>
-          <w:sz w:val="20"/>
-          <w:u w:val="none"/>
-        </w:rPr>
-        <w:t>│                        │ Local filesystem output for full dashboard.      │</w:t>
-      </w:r>
-    </w:p>
-    <w:p>
-      <w:pPr>
-        <w:spacing w:before="0" w:after="80"/>
-      </w:pPr>
-      <w:r>
-        <w:rPr>
-          <w:rFonts w:ascii="Calibri" w:hAnsi="Calibri"/>
-          <w:b w:val="0"/>
-          <w:i w:val="0"/>
-          <w:color w:val="000000"/>
-          <w:sz w:val="20"/>
-          <w:u w:val="none"/>
-        </w:rPr>
-        <w:t>├────────────────────────┼──────────────────────────────────────────────────┤</w:t>
-      </w:r>
-    </w:p>
-    <w:p>
-      <w:pPr>
-        <w:spacing w:before="0" w:after="80"/>
-      </w:pPr>
-      <w:r>
-        <w:rPr>
-          <w:rFonts w:ascii="Calibri" w:hAnsi="Calibri"/>
-          <w:b w:val="0"/>
-          <w:i w:val="0"/>
-          <w:color w:val="000000"/>
-          <w:sz w:val="20"/>
-          <w:u w:val="none"/>
-        </w:rPr>
-        <w:t>│ paths.output_network   │ \\TUPETT-FI01\Data$\Malshare\Cyclotron\          │</w:t>
-      </w:r>
-    </w:p>
-    <w:p>
-      <w:pPr>
-        <w:spacing w:before="0" w:after="80"/>
-      </w:pPr>
-      <w:r>
-        <w:rPr>
-          <w:rFonts w:ascii="Calibri" w:hAnsi="Calibri"/>
-          <w:b w:val="0"/>
-          <w:i w:val="0"/>
-          <w:color w:val="000000"/>
-          <w:sz w:val="20"/>
-          <w:u w:val="none"/>
-        </w:rPr>
-        <w:t>│                        │   Dashboard Cyclotron\isotope_dashboard.html     │</w:t>
-      </w:r>
-    </w:p>
-    <w:p>
-      <w:pPr>
-        <w:spacing w:before="0" w:after="80"/>
-      </w:pPr>
-      <w:r>
-        <w:rPr>
-          <w:rFonts w:ascii="Calibri" w:hAnsi="Calibri"/>
-          <w:b w:val="0"/>
-          <w:i w:val="0"/>
-          <w:color w:val="000000"/>
-          <w:sz w:val="20"/>
-          <w:u w:val="none"/>
-        </w:rPr>
-        <w:t>├────────────────────────┼──────────────────────────────────────────────────┤</w:t>
-      </w:r>
-    </w:p>
-    <w:p>
-      <w:pPr>
-        <w:spacing w:before="0" w:after="80"/>
-      </w:pPr>
-      <w:r>
-        <w:rPr>
-          <w:rFonts w:ascii="Calibri" w:hAnsi="Calibri"/>
-          <w:b w:val="0"/>
-          <w:i w:val="0"/>
-          <w:color w:val="000000"/>
-          <w:sz w:val="20"/>
-          <w:u w:val="none"/>
-        </w:rPr>
-        <w:t>│ paths.output_bureau    │ X:\Cyclotron Bureau\Productie dashboard.html     │</w:t>
-      </w:r>
-    </w:p>
-    <w:p>
-      <w:pPr>
-        <w:spacing w:before="0" w:after="80"/>
-      </w:pPr>
-      <w:r>
-        <w:rPr>
-          <w:rFonts w:ascii="Calibri" w:hAnsi="Calibri"/>
-          <w:b w:val="0"/>
-          <w:i w:val="0"/>
-          <w:color w:val="000000"/>
-          <w:sz w:val="20"/>
-          <w:u w:val="none"/>
-        </w:rPr>
-        <w:t>└────────────────────────┴──────────────────────────────────────────────────┘</w:t>
-      </w:r>
-    </w:p>
+    <w:tbl>
+      <w:tblPr>
+        <w:tblStyle w:val="TableGrid"/>
+        <w:tblW w:type="auto" w:w="0"/>
+        <w:tblLook w:firstColumn="1" w:firstRow="1" w:lastColumn="0" w:lastRow="0" w:noHBand="0" w:noVBand="1" w:val="04A0"/>
+      </w:tblPr>
+      <w:tblGrid>
+        <w:gridCol w:w="4536"/>
+        <w:gridCol w:w="4536"/>
+      </w:tblGrid>
+      <w:tr>
+        <w:tc>
+          <w:tcPr>
+            <w:tcW w:type="dxa" w:w="4536"/>
+            <w:tcW w:w="2551" w:type="dxa"/>
+            <w:shd w:val="clear" w:color="auto" w:fill="EDE7F0"/>
+          </w:tcPr>
+          <w:p>
+            <w:pPr>
+              <w:spacing w:before="40" w:after="40"/>
+            </w:pPr>
+            <w:r>
+              <w:rPr>
+                <w:rFonts w:ascii="Calibri" w:hAnsi="Calibri"/>
+                <w:b/>
+                <w:i w:val="0"/>
+                <w:color w:val="4B1E52"/>
+                <w:sz w:val="18"/>
+                <w:u w:val="none"/>
+              </w:rPr>
+              <w:t>paths.raw_db</w:t>
+            </w:r>
+          </w:p>
+        </w:tc>
+        <w:tc>
+          <w:tcPr>
+            <w:tcW w:type="dxa" w:w="4536"/>
+            <w:tcW w:w="6519" w:type="dxa"/>
+          </w:tcPr>
+          <w:p>
+            <w:pPr>
+              <w:spacing w:before="40" w:after="40"/>
+            </w:pPr>
+            <w:r>
+              <w:rPr>
+                <w:rFonts w:ascii="Calibri" w:hAnsi="Calibri"/>
+                <w:b w:val="0"/>
+                <w:i w:val="0"/>
+                <w:color w:val="000000"/>
+                <w:sz w:val="18"/>
+                <w:u w:val="none"/>
+              </w:rPr>
+              <w:t>data/raw.db SQLite database for raw production records.</w:t>
+            </w:r>
+          </w:p>
+        </w:tc>
+      </w:tr>
+      <w:tr>
+        <w:tc>
+          <w:tcPr>
+            <w:tcW w:type="dxa" w:w="4536"/>
+            <w:tcW w:w="2551" w:type="dxa"/>
+            <w:shd w:val="clear" w:color="auto" w:fill="EDE7F0"/>
+          </w:tcPr>
+          <w:p>
+            <w:pPr>
+              <w:spacing w:before="40" w:after="40"/>
+            </w:pPr>
+            <w:r>
+              <w:rPr>
+                <w:rFonts w:ascii="Calibri" w:hAnsi="Calibri"/>
+                <w:b/>
+                <w:i w:val="0"/>
+                <w:color w:val="4B1E52"/>
+                <w:sz w:val="18"/>
+                <w:u w:val="none"/>
+              </w:rPr>
+              <w:t>paths.derived_db</w:t>
+            </w:r>
+          </w:p>
+        </w:tc>
+        <w:tc>
+          <w:tcPr>
+            <w:tcW w:type="dxa" w:w="4536"/>
+            <w:tcW w:w="6519" w:type="dxa"/>
+          </w:tcPr>
+          <w:p>
+            <w:pPr>
+              <w:spacing w:before="40" w:after="40"/>
+            </w:pPr>
+            <w:r>
+              <w:rPr>
+                <w:rFonts w:ascii="Calibri" w:hAnsi="Calibri"/>
+                <w:b w:val="0"/>
+                <w:i w:val="0"/>
+                <w:color w:val="000000"/>
+                <w:sz w:val="18"/>
+                <w:u w:val="none"/>
+              </w:rPr>
+              <w:t>data/derived.db SQLite database for computed KPIs.</w:t>
+            </w:r>
+          </w:p>
+        </w:tc>
+      </w:tr>
+      <w:tr>
+        <w:tc>
+          <w:tcPr>
+            <w:tcW w:type="dxa" w:w="4536"/>
+            <w:tcW w:w="2551" w:type="dxa"/>
+            <w:shd w:val="clear" w:color="auto" w:fill="EDE7F0"/>
+          </w:tcPr>
+          <w:p>
+            <w:pPr>
+              <w:spacing w:before="40" w:after="40"/>
+            </w:pPr>
+            <w:r>
+              <w:rPr>
+                <w:rFonts w:ascii="Calibri" w:hAnsi="Calibri"/>
+                <w:b/>
+                <w:i w:val="0"/>
+                <w:color w:val="4B1E52"/>
+                <w:sz w:val="18"/>
+                <w:u w:val="none"/>
+              </w:rPr>
+              <w:t>paths.bestralingen_db</w:t>
+            </w:r>
+          </w:p>
+        </w:tc>
+        <w:tc>
+          <w:tcPr>
+            <w:tcW w:type="dxa" w:w="4536"/>
+            <w:tcW w:w="6519" w:type="dxa"/>
+          </w:tcPr>
+          <w:p>
+            <w:pPr>
+              <w:spacing w:before="40" w:after="40"/>
+            </w:pPr>
+            <w:r>
+              <w:rPr>
+                <w:rFonts w:ascii="Calibri" w:hAnsi="Calibri"/>
+                <w:b w:val="0"/>
+                <w:i w:val="0"/>
+                <w:color w:val="000000"/>
+                <w:sz w:val="18"/>
+                <w:u w:val="none"/>
+              </w:rPr>
+              <w:t>\\TUPETT-FI01\Data$\Malshare\Proc\Metrics\ thalliumproces\bestralingen.mdb MS Access — primary isotope production records. REQUIRED: pipeline aborts if unreachable.</w:t>
+            </w:r>
+          </w:p>
+        </w:tc>
+      </w:tr>
+      <w:tr>
+        <w:tc>
+          <w:tcPr>
+            <w:tcW w:type="dxa" w:w="4536"/>
+            <w:tcW w:w="2551" w:type="dxa"/>
+            <w:shd w:val="clear" w:color="auto" w:fill="EDE7F0"/>
+          </w:tcPr>
+          <w:p>
+            <w:pPr>
+              <w:spacing w:before="40" w:after="40"/>
+            </w:pPr>
+            <w:r>
+              <w:rPr>
+                <w:rFonts w:ascii="Calibri" w:hAnsi="Calibri"/>
+                <w:b/>
+                <w:i w:val="0"/>
+                <w:color w:val="4B1E52"/>
+                <w:sz w:val="18"/>
+                <w:u w:val="none"/>
+              </w:rPr>
+              <w:t>paths.proces_db</w:t>
+            </w:r>
+          </w:p>
+        </w:tc>
+        <w:tc>
+          <w:tcPr>
+            <w:tcW w:type="dxa" w:w="4536"/>
+            <w:tcW w:w="6519" w:type="dxa"/>
+          </w:tcPr>
+          <w:p>
+            <w:pPr>
+              <w:spacing w:before="40" w:after="40"/>
+            </w:pPr>
+            <w:r>
+              <w:rPr>
+                <w:rFonts w:ascii="Calibri" w:hAnsi="Calibri"/>
+                <w:b w:val="0"/>
+                <w:i w:val="0"/>
+                <w:color w:val="000000"/>
+                <w:sz w:val="18"/>
+                <w:u w:val="none"/>
+              </w:rPr>
+              <w:t>W:\Maximo\ProcesGegevens.accdb MS Access — efficiency targets and yield data.</w:t>
+            </w:r>
+          </w:p>
+        </w:tc>
+      </w:tr>
+      <w:tr>
+        <w:tc>
+          <w:tcPr>
+            <w:tcW w:type="dxa" w:w="4536"/>
+            <w:tcW w:w="2551" w:type="dxa"/>
+            <w:shd w:val="clear" w:color="auto" w:fill="EDE7F0"/>
+          </w:tcPr>
+          <w:p>
+            <w:pPr>
+              <w:spacing w:before="40" w:after="40"/>
+            </w:pPr>
+            <w:r>
+              <w:rPr>
+                <w:rFonts w:ascii="Calibri" w:hAnsi="Calibri"/>
+                <w:b/>
+                <w:i w:val="0"/>
+                <w:color w:val="4B1E52"/>
+                <w:sz w:val="18"/>
+                <w:u w:val="none"/>
+              </w:rPr>
+              <w:t>paths.storingen_iba_db</w:t>
+            </w:r>
+          </w:p>
+        </w:tc>
+        <w:tc>
+          <w:tcPr>
+            <w:tcW w:type="dxa" w:w="4536"/>
+            <w:tcW w:w="6519" w:type="dxa"/>
+          </w:tcPr>
+          <w:p>
+            <w:pPr>
+              <w:spacing w:before="40" w:after="40"/>
+            </w:pPr>
+            <w:r>
+              <w:rPr>
+                <w:rFonts w:ascii="Calibri" w:hAnsi="Calibri"/>
+                <w:b w:val="0"/>
+                <w:i w:val="0"/>
+                <w:color w:val="000000"/>
+                <w:sz w:val="18"/>
+                <w:u w:val="none"/>
+              </w:rPr>
+              <w:t>\\NLPT-FILE01P\Dept$\NLCYC\Storingen IBA\ Storingen_IBA.accdb MS Access — IBA cyclotron downtime records.</w:t>
+            </w:r>
+          </w:p>
+        </w:tc>
+      </w:tr>
+      <w:tr>
+        <w:tc>
+          <w:tcPr>
+            <w:tcW w:type="dxa" w:w="4536"/>
+            <w:tcW w:w="2551" w:type="dxa"/>
+            <w:shd w:val="clear" w:color="auto" w:fill="EDE7F0"/>
+          </w:tcPr>
+          <w:p>
+            <w:pPr>
+              <w:spacing w:before="40" w:after="40"/>
+            </w:pPr>
+            <w:r>
+              <w:rPr>
+                <w:rFonts w:ascii="Calibri" w:hAnsi="Calibri"/>
+                <w:b/>
+                <w:i w:val="0"/>
+                <w:color w:val="4B1E52"/>
+                <w:sz w:val="18"/>
+                <w:u w:val="none"/>
+              </w:rPr>
+              <w:t>paths.storingen_philips_db</w:t>
+            </w:r>
+          </w:p>
+        </w:tc>
+        <w:tc>
+          <w:tcPr>
+            <w:tcW w:type="dxa" w:w="4536"/>
+            <w:tcW w:w="6519" w:type="dxa"/>
+          </w:tcPr>
+          <w:p>
+            <w:pPr>
+              <w:spacing w:before="40" w:after="40"/>
+            </w:pPr>
+            <w:r>
+              <w:rPr>
+                <w:rFonts w:ascii="Calibri" w:hAnsi="Calibri"/>
+                <w:b w:val="0"/>
+                <w:i w:val="0"/>
+                <w:color w:val="000000"/>
+                <w:sz w:val="18"/>
+                <w:u w:val="none"/>
+              </w:rPr>
+              <w:t>\\NLPT-FILE01P\Dept$\NLCYC\Storingen Philips\ Storingen_Philips.accdb</w:t>
+            </w:r>
+          </w:p>
+        </w:tc>
+      </w:tr>
+      <w:tr>
+        <w:tc>
+          <w:tcPr>
+            <w:tcW w:type="dxa" w:w="4536"/>
+            <w:tcW w:w="2551" w:type="dxa"/>
+            <w:shd w:val="clear" w:color="auto" w:fill="EDE7F0"/>
+          </w:tcPr>
+          <w:p>
+            <w:pPr>
+              <w:spacing w:before="40" w:after="40"/>
+            </w:pPr>
+            <w:r>
+              <w:rPr>
+                <w:rFonts w:ascii="Calibri" w:hAnsi="Calibri"/>
+                <w:b/>
+                <w:i w:val="0"/>
+                <w:color w:val="4B1E52"/>
+                <w:sz w:val="18"/>
+                <w:u w:val="none"/>
+              </w:rPr>
+              <w:t>paths.ploegen_excel</w:t>
+            </w:r>
+          </w:p>
+        </w:tc>
+        <w:tc>
+          <w:tcPr>
+            <w:tcW w:type="dxa" w:w="4536"/>
+            <w:tcW w:w="6519" w:type="dxa"/>
+          </w:tcPr>
+          <w:p>
+            <w:pPr>
+              <w:spacing w:before="40" w:after="40"/>
+            </w:pPr>
+            <w:r>
+              <w:rPr>
+                <w:rFonts w:ascii="Calibri" w:hAnsi="Calibri"/>
+                <w:b w:val="0"/>
+                <w:i w:val="0"/>
+                <w:color w:val="000000"/>
+                <w:sz w:val="18"/>
+                <w:u w:val="none"/>
+              </w:rPr>
+              <w:t>C:\Users\Reinder.sierkstra\Desktop\ Dosis_overzichten\Ploegen.xlsx</w:t>
+            </w:r>
+          </w:p>
+        </w:tc>
+      </w:tr>
+      <w:tr>
+        <w:tc>
+          <w:tcPr>
+            <w:tcW w:type="dxa" w:w="4536"/>
+            <w:tcW w:w="2551" w:type="dxa"/>
+            <w:shd w:val="clear" w:color="auto" w:fill="EDE7F0"/>
+          </w:tcPr>
+          <w:p>
+            <w:pPr>
+              <w:spacing w:before="40" w:after="40"/>
+            </w:pPr>
+            <w:r>
+              <w:rPr>
+                <w:rFonts w:ascii="Calibri" w:hAnsi="Calibri"/>
+                <w:b/>
+                <w:i w:val="0"/>
+                <w:color w:val="4B1E52"/>
+                <w:sz w:val="18"/>
+                <w:u w:val="none"/>
+              </w:rPr>
+              <w:t>paths.planning_excel</w:t>
+            </w:r>
+          </w:p>
+        </w:tc>
+        <w:tc>
+          <w:tcPr>
+            <w:tcW w:type="dxa" w:w="4536"/>
+            <w:tcW w:w="6519" w:type="dxa"/>
+          </w:tcPr>
+          <w:p>
+            <w:pPr>
+              <w:spacing w:before="40" w:after="40"/>
+            </w:pPr>
+            <w:r>
+              <w:rPr>
+                <w:rFonts w:ascii="Calibri" w:hAnsi="Calibri"/>
+                <w:b w:val="0"/>
+                <w:i w:val="0"/>
+                <w:color w:val="000000"/>
+                <w:sz w:val="18"/>
+                <w:u w:val="none"/>
+              </w:rPr>
+              <w:t>W:\Afdelingsplanning Cyclotron\ Planning &amp; Control Cyclotron.xlsm</w:t>
+            </w:r>
+          </w:p>
+        </w:tc>
+      </w:tr>
+      <w:tr>
+        <w:tc>
+          <w:tcPr>
+            <w:tcW w:type="dxa" w:w="4536"/>
+            <w:tcW w:w="2551" w:type="dxa"/>
+            <w:shd w:val="clear" w:color="auto" w:fill="EDE7F0"/>
+          </w:tcPr>
+          <w:p>
+            <w:pPr>
+              <w:spacing w:before="40" w:after="40"/>
+            </w:pPr>
+            <w:r>
+              <w:rPr>
+                <w:rFonts w:ascii="Calibri" w:hAnsi="Calibri"/>
+                <w:b/>
+                <w:i w:val="0"/>
+                <w:color w:val="4B1E52"/>
+                <w:sz w:val="18"/>
+                <w:u w:val="none"/>
+              </w:rPr>
+              <w:t>paths.vsm_excel</w:t>
+            </w:r>
+          </w:p>
+        </w:tc>
+        <w:tc>
+          <w:tcPr>
+            <w:tcW w:type="dxa" w:w="4536"/>
+            <w:tcW w:w="6519" w:type="dxa"/>
+          </w:tcPr>
+          <w:p>
+            <w:pPr>
+              <w:spacing w:before="40" w:after="40"/>
+            </w:pPr>
+            <w:r>
+              <w:rPr>
+                <w:rFonts w:ascii="Calibri" w:hAnsi="Calibri"/>
+                <w:b w:val="0"/>
+                <w:i w:val="0"/>
+                <w:color w:val="000000"/>
+                <w:sz w:val="18"/>
+                <w:u w:val="none"/>
+              </w:rPr>
+              <w:t>C:\Users\Reinder.sierkstra\OneDrive - CURIUM\ Niet onedrive spullen\Desktop\ Targetstroom daily management VSM cyclotron .xlsx</w:t>
+            </w:r>
+          </w:p>
+        </w:tc>
+      </w:tr>
+      <w:tr>
+        <w:tc>
+          <w:tcPr>
+            <w:tcW w:type="dxa" w:w="4536"/>
+            <w:tcW w:w="2551" w:type="dxa"/>
+            <w:shd w:val="clear" w:color="auto" w:fill="EDE7F0"/>
+          </w:tcPr>
+          <w:p>
+            <w:pPr>
+              <w:spacing w:before="40" w:after="40"/>
+            </w:pPr>
+            <w:r>
+              <w:rPr>
+                <w:rFonts w:ascii="Calibri" w:hAnsi="Calibri"/>
+                <w:b/>
+                <w:i w:val="0"/>
+                <w:color w:val="4B1E52"/>
+                <w:sz w:val="18"/>
+                <w:u w:val="none"/>
+              </w:rPr>
+              <w:t>paths.planning_html</w:t>
+            </w:r>
+          </w:p>
+        </w:tc>
+        <w:tc>
+          <w:tcPr>
+            <w:tcW w:type="dxa" w:w="4536"/>
+            <w:tcW w:w="6519" w:type="dxa"/>
+          </w:tcPr>
+          <w:p>
+            <w:pPr>
+              <w:spacing w:before="40" w:after="40"/>
+            </w:pPr>
+            <w:r>
+              <w:rPr>
+                <w:rFonts w:ascii="Calibri" w:hAnsi="Calibri"/>
+                <w:b w:val="0"/>
+                <w:i w:val="0"/>
+                <w:color w:val="000000"/>
+                <w:sz w:val="18"/>
+                <w:u w:val="none"/>
+              </w:rPr>
+              <w:t>W:\Afdelingsplanning Cyclotron\planning.html</w:t>
+            </w:r>
+          </w:p>
+        </w:tc>
+      </w:tr>
+      <w:tr>
+        <w:tc>
+          <w:tcPr>
+            <w:tcW w:type="dxa" w:w="4536"/>
+            <w:tcW w:w="2551" w:type="dxa"/>
+            <w:shd w:val="clear" w:color="auto" w:fill="EDE7F0"/>
+          </w:tcPr>
+          <w:p>
+            <w:pPr>
+              <w:spacing w:before="40" w:after="40"/>
+            </w:pPr>
+            <w:r>
+              <w:rPr>
+                <w:rFonts w:ascii="Calibri" w:hAnsi="Calibri"/>
+                <w:b/>
+                <w:i w:val="0"/>
+                <w:color w:val="4B1E52"/>
+                <w:sz w:val="18"/>
+                <w:u w:val="none"/>
+              </w:rPr>
+              <w:t>paths.productieschema_html</w:t>
+            </w:r>
+          </w:p>
+        </w:tc>
+        <w:tc>
+          <w:tcPr>
+            <w:tcW w:type="dxa" w:w="4536"/>
+            <w:tcW w:w="6519" w:type="dxa"/>
+          </w:tcPr>
+          <w:p>
+            <w:pPr>
+              <w:spacing w:before="40" w:after="40"/>
+            </w:pPr>
+            <w:r>
+              <w:rPr>
+                <w:rFonts w:ascii="Calibri" w:hAnsi="Calibri"/>
+                <w:b w:val="0"/>
+                <w:i w:val="0"/>
+                <w:color w:val="000000"/>
+                <w:sz w:val="18"/>
+                <w:u w:val="none"/>
+              </w:rPr>
+              <w:t>W:\Desktop Settings\Cyclotron formulieren\ 0 (BETA) Cyclotron productieplanning.html</w:t>
+            </w:r>
+          </w:p>
+        </w:tc>
+      </w:tr>
+      <w:tr>
+        <w:tc>
+          <w:tcPr>
+            <w:tcW w:type="dxa" w:w="4536"/>
+            <w:tcW w:w="2551" w:type="dxa"/>
+            <w:shd w:val="clear" w:color="auto" w:fill="EDE7F0"/>
+          </w:tcPr>
+          <w:p>
+            <w:pPr>
+              <w:spacing w:before="40" w:after="40"/>
+            </w:pPr>
+            <w:r>
+              <w:rPr>
+                <w:rFonts w:ascii="Calibri" w:hAnsi="Calibri"/>
+                <w:b/>
+                <w:i w:val="0"/>
+                <w:color w:val="4B1E52"/>
+                <w:sz w:val="18"/>
+                <w:u w:val="none"/>
+              </w:rPr>
+              <w:t>paths.output_local</w:t>
+            </w:r>
+          </w:p>
+        </w:tc>
+        <w:tc>
+          <w:tcPr>
+            <w:tcW w:type="dxa" w:w="4536"/>
+            <w:tcW w:w="6519" w:type="dxa"/>
+          </w:tcPr>
+          <w:p>
+            <w:pPr>
+              <w:spacing w:before="40" w:after="40"/>
+            </w:pPr>
+            <w:r>
+              <w:rPr>
+                <w:rFonts w:ascii="Calibri" w:hAnsi="Calibri"/>
+                <w:b w:val="0"/>
+                <w:i w:val="0"/>
+                <w:color w:val="000000"/>
+                <w:sz w:val="18"/>
+                <w:u w:val="none"/>
+              </w:rPr>
+              <w:t>output/isotope_dashboard.html Local filesystem output for full dashboard.</w:t>
+            </w:r>
+          </w:p>
+        </w:tc>
+      </w:tr>
+      <w:tr>
+        <w:tc>
+          <w:tcPr>
+            <w:tcW w:type="dxa" w:w="4536"/>
+            <w:tcW w:w="2551" w:type="dxa"/>
+            <w:shd w:val="clear" w:color="auto" w:fill="EDE7F0"/>
+          </w:tcPr>
+          <w:p>
+            <w:pPr>
+              <w:spacing w:before="40" w:after="40"/>
+            </w:pPr>
+            <w:r>
+              <w:rPr>
+                <w:rFonts w:ascii="Calibri" w:hAnsi="Calibri"/>
+                <w:b/>
+                <w:i w:val="0"/>
+                <w:color w:val="4B1E52"/>
+                <w:sz w:val="18"/>
+                <w:u w:val="none"/>
+              </w:rPr>
+              <w:t>paths.output_network</w:t>
+            </w:r>
+          </w:p>
+        </w:tc>
+        <w:tc>
+          <w:tcPr>
+            <w:tcW w:type="dxa" w:w="4536"/>
+            <w:tcW w:w="6519" w:type="dxa"/>
+          </w:tcPr>
+          <w:p>
+            <w:pPr>
+              <w:spacing w:before="40" w:after="40"/>
+            </w:pPr>
+            <w:r>
+              <w:rPr>
+                <w:rFonts w:ascii="Calibri" w:hAnsi="Calibri"/>
+                <w:b w:val="0"/>
+                <w:i w:val="0"/>
+                <w:color w:val="000000"/>
+                <w:sz w:val="18"/>
+                <w:u w:val="none"/>
+              </w:rPr>
+              <w:t>\\TUPETT-FI01\Data$\Malshare\Cyclotron\ Dashboard Cyclotron\isotope_dashboard.html</w:t>
+            </w:r>
+          </w:p>
+        </w:tc>
+      </w:tr>
+      <w:tr>
+        <w:tc>
+          <w:tcPr>
+            <w:tcW w:type="dxa" w:w="4536"/>
+            <w:tcW w:w="2551" w:type="dxa"/>
+            <w:shd w:val="clear" w:color="auto" w:fill="EDE7F0"/>
+          </w:tcPr>
+          <w:p>
+            <w:pPr>
+              <w:spacing w:before="40" w:after="40"/>
+            </w:pPr>
+            <w:r>
+              <w:rPr>
+                <w:rFonts w:ascii="Calibri" w:hAnsi="Calibri"/>
+                <w:b/>
+                <w:i w:val="0"/>
+                <w:color w:val="4B1E52"/>
+                <w:sz w:val="18"/>
+                <w:u w:val="none"/>
+              </w:rPr>
+              <w:t>paths.output_bureau</w:t>
+            </w:r>
+          </w:p>
+        </w:tc>
+        <w:tc>
+          <w:tcPr>
+            <w:tcW w:type="dxa" w:w="4536"/>
+            <w:tcW w:w="6519" w:type="dxa"/>
+          </w:tcPr>
+          <w:p>
+            <w:pPr>
+              <w:spacing w:before="40" w:after="40"/>
+            </w:pPr>
+            <w:r>
+              <w:rPr>
+                <w:rFonts w:ascii="Calibri" w:hAnsi="Calibri"/>
+                <w:b w:val="0"/>
+                <w:i w:val="0"/>
+                <w:color w:val="000000"/>
+                <w:sz w:val="18"/>
+                <w:u w:val="none"/>
+              </w:rPr>
+              <w:t>X:\Cyclotron Bureau\Productie dashboard.html</w:t>
+            </w:r>
+          </w:p>
+        </w:tc>
+      </w:tr>
+    </w:tbl>
+    <w:p/>
     <w:p>
       <w:pPr>
         <w:spacing w:before="0" w:after="80"/>

</xml_diff>

<commit_message>
Fix Rb-82 → Rb-81 in Isotope_Dashboard_Manual.docx
Two occurrences updated:
  - Isotope list: Rb-82 / Rubidium-82 → Rb-81 / Rubidium-81
  - Gantt colour table: Rb-082 → Rb-081

https://claude.ai/code/session_015B3yXKTR8ayRzVbvAmrArn
</commit_message>
<xml_diff>
--- a/Isotope_Dashboard_Manual.docx
+++ b/Isotope_Dashboard_Manual.docx
@@ -2277,7 +2277,7 @@
           <w:sz w:val="18"/>
           <w:u w:val="none"/>
         </w:rPr>
-        <w:t xml:space="preserve">    Rb-82   Rubidium-82</w:t>
+        <w:t xml:space="preserve">    Rb-81   Rubidium-81</w:t>
       </w:r>
     </w:p>
     <w:p>
@@ -22212,7 +22212,7 @@
           <w:sz w:val="18"/>
           <w:u w:val="none"/>
         </w:rPr>
-        <w:t xml:space="preserve">    RB081 / Rb-082   red    #FF0000</w:t>
+        <w:t xml:space="preserve">    RB081 / Rb-081   red    #FF0000</w:t>
       </w:r>
     </w:p>
     <w:p>

</xml_diff>

<commit_message>
Rebuild Isotope_Dashboard_Manual.docx to reflect updated file paths
Regenerated from MANUAL.txt after updating ploegen_excel and vsm_excel paths
to their canonical X:\ shared-drive locations.

https://claude.ai/code/session_015B3yXKTR8ayRzVbvAmrArn
</commit_message>
<xml_diff>
--- a/Isotope_Dashboard_Manual.docx
+++ b/Isotope_Dashboard_Manual.docx
@@ -24278,7 +24278,7 @@
                 <w:sz w:val="18"/>
                 <w:u w:val="none"/>
               </w:rPr>
-              <w:t>C:\Users\Reinder.sierkstra\Desktop\ Dosis_overzichten\Ploegen.xlsx</w:t>
+              <w:t>X:\Cyclotron Bureau\Programma script\ Dosiserv script\Ploegen.xlsx</w:t>
             </w:r>
           </w:p>
         </w:tc>
@@ -24372,7 +24372,7 @@
                 <w:sz w:val="18"/>
                 <w:u w:val="none"/>
               </w:rPr>
-              <w:t>C:\Users\Reinder.sierkstra\OneDrive - CURIUM\ Niet onedrive spullen\Desktop\ Targetstroom daily management VSM cyclotron .xlsx</w:t>
+              <w:t>X:\Cyclotron Bureau\Programma script\ DM VSM script\Targetstroom daily management VSM cyclotron.xlsx</w:t>
             </w:r>
           </w:p>
         </w:tc>

</xml_diff>